<commit_message>
V18 FINAL: Ethics shortened, Table 4 repositioned, Data Availability corrected, full code and datasets
</commit_message>
<xml_diff>
--- a/Supplementary_Information/S3_Table_READUS_PV_Checklist.docx
+++ b/Supplementary_Information/S3_Table_READUS_PV_Checklist.docx
@@ -17,7 +17,7 @@
     </w:p>
     <w:p>
       <w:r>
-        <w:t>Checklist completed against PONE_Condensed_V12 manuscript.</w:t>
+        <w:t>Checklist completed against PONE_Condensed_the submitted manuscript manuscript.</w:t>
       </w:r>
     </w:p>
     <w:p/>
@@ -70,7 +70,7 @@
           </w:tcPr>
           <w:p>
             <w:r>
-              <w:t>Location in V12</w:t>
+              <w:t>Location in manuscript</w:t>
             </w:r>
           </w:p>
         </w:tc>
@@ -364,7 +364,7 @@
           </w:tcPr>
           <w:p>
             <w:r>
-              <w:t>Materials and methods: Data source and preprocessing (MedDRA v26.0, PT and SOC levels)</w:t>
+              <w:t>Materials and methods: Data source and preprocessing (MedDRA v28.1, PT and SOC levels)</w:t>
             </w:r>
           </w:p>
         </w:tc>
@@ -406,7 +406,7 @@
           </w:tcPr>
           <w:p>
             <w:r>
-              <w:t>Materials and methods: Data source and preprocessing (MedDRA v26.0) [17]</w:t>
+              <w:t>Materials and methods: Data source and preprocessing (MedDRA v28.1) [17]</w:t>
             </w:r>
           </w:p>
         </w:tc>

</xml_diff>